<commit_message>
Cambio en el reporte de permisos ext
</commit_message>
<xml_diff>
--- a/src/templates/permisosExtTemplate.docx
+++ b/src/templates/permisosExtTemplate.docx
@@ -1103,6 +1103,7 @@
     </w:p>
     <w:p>
       <w:pPr>
+        <w:spacing w:after="0"/>
         <w:rPr>
           <w:rFonts w:ascii="Arial" w:hAnsi="Arial" w:cs="Arial"/>
           <w:b/>
@@ -1123,6 +1124,450 @@
         </w:rPr>
         <w:t>3.- HISTORIAL DE PERMISOS</w:t>
       </w:r>
+    </w:p>
+    <w:tbl>
+      <w:tblPr>
+        <w:tblStyle w:val="Tablaconcuadrculaclara"/>
+        <w:tblW w:w="5000" w:type="pct"/>
+        <w:tblBorders>
+          <w:top w:val="single" w:sz="4" w:space="0" w:color="auto"/>
+          <w:left w:val="single" w:sz="4" w:space="0" w:color="auto"/>
+          <w:bottom w:val="single" w:sz="4" w:space="0" w:color="auto"/>
+          <w:right w:val="single" w:sz="4" w:space="0" w:color="auto"/>
+          <w:insideH w:val="single" w:sz="4" w:space="0" w:color="auto"/>
+          <w:insideV w:val="single" w:sz="4" w:space="0" w:color="auto"/>
+        </w:tblBorders>
+        <w:tblLayout w:type="fixed"/>
+        <w:tblLook w:val="04A0" w:firstRow="1" w:lastRow="0" w:firstColumn="1" w:lastColumn="0" w:noHBand="0" w:noVBand="1"/>
+      </w:tblPr>
+      <w:tblGrid>
+        <w:gridCol w:w="439"/>
+        <w:gridCol w:w="1682"/>
+        <w:gridCol w:w="1275"/>
+        <w:gridCol w:w="1277"/>
+        <w:gridCol w:w="710"/>
+        <w:gridCol w:w="1559"/>
+        <w:gridCol w:w="1886"/>
+      </w:tblGrid>
+      <w:tr>
+        <w:tc>
+          <w:tcPr>
+            <w:tcW w:w="249" w:type="pct"/>
+            <w:shd w:val="clear" w:color="auto" w:fill="D9D9D9" w:themeFill="background1" w:themeFillShade="D9"/>
+          </w:tcPr>
+          <w:p>
+            <w:pPr>
+              <w:rPr>
+                <w:rFonts w:ascii="Arial" w:hAnsi="Arial" w:cs="Arial"/>
+                <w:b/>
+                <w:bCs/>
+                <w:sz w:val="20"/>
+                <w:szCs w:val="20"/>
+                <w:lang w:val="es-419"/>
+              </w:rPr>
+            </w:pPr>
+            <w:r>
+              <w:rPr>
+                <w:rFonts w:ascii="Arial" w:hAnsi="Arial" w:cs="Arial"/>
+                <w:b/>
+                <w:bCs/>
+                <w:sz w:val="20"/>
+                <w:szCs w:val="20"/>
+                <w:lang w:val="es-419"/>
+              </w:rPr>
+              <w:t>#</w:t>
+            </w:r>
+          </w:p>
+        </w:tc>
+        <w:tc>
+          <w:tcPr>
+            <w:tcW w:w="953" w:type="pct"/>
+            <w:shd w:val="clear" w:color="auto" w:fill="D9D9D9" w:themeFill="background1" w:themeFillShade="D9"/>
+          </w:tcPr>
+          <w:p>
+            <w:pPr>
+              <w:rPr>
+                <w:rFonts w:ascii="Arial" w:hAnsi="Arial" w:cs="Arial"/>
+                <w:b/>
+                <w:bCs/>
+                <w:sz w:val="20"/>
+                <w:szCs w:val="20"/>
+                <w:lang w:val="es-419"/>
+              </w:rPr>
+            </w:pPr>
+            <w:r>
+              <w:rPr>
+                <w:rFonts w:ascii="Arial" w:hAnsi="Arial" w:cs="Arial"/>
+                <w:b/>
+                <w:bCs/>
+                <w:sz w:val="20"/>
+                <w:szCs w:val="20"/>
+                <w:lang w:val="es-419"/>
+              </w:rPr>
+              <w:t>TIPO</w:t>
+            </w:r>
+          </w:p>
+        </w:tc>
+        <w:tc>
+          <w:tcPr>
+            <w:tcW w:w="722" w:type="pct"/>
+            <w:shd w:val="clear" w:color="auto" w:fill="D9D9D9" w:themeFill="background1" w:themeFillShade="D9"/>
+          </w:tcPr>
+          <w:p>
+            <w:pPr>
+              <w:rPr>
+                <w:rFonts w:ascii="Arial" w:hAnsi="Arial" w:cs="Arial"/>
+                <w:b/>
+                <w:bCs/>
+                <w:sz w:val="20"/>
+                <w:szCs w:val="20"/>
+                <w:lang w:val="es-419"/>
+              </w:rPr>
+            </w:pPr>
+            <w:r>
+              <w:rPr>
+                <w:rFonts w:ascii="Arial" w:hAnsi="Arial" w:cs="Arial"/>
+                <w:b/>
+                <w:bCs/>
+                <w:sz w:val="20"/>
+                <w:szCs w:val="20"/>
+                <w:lang w:val="es-419"/>
+              </w:rPr>
+              <w:t>DESDE</w:t>
+            </w:r>
+          </w:p>
+        </w:tc>
+        <w:tc>
+          <w:tcPr>
+            <w:tcW w:w="723" w:type="pct"/>
+            <w:shd w:val="clear" w:color="auto" w:fill="D9D9D9" w:themeFill="background1" w:themeFillShade="D9"/>
+          </w:tcPr>
+          <w:p>
+            <w:pPr>
+              <w:rPr>
+                <w:rFonts w:ascii="Arial" w:hAnsi="Arial" w:cs="Arial"/>
+                <w:b/>
+                <w:bCs/>
+                <w:sz w:val="20"/>
+                <w:szCs w:val="20"/>
+                <w:lang w:val="es-419"/>
+              </w:rPr>
+            </w:pPr>
+            <w:r>
+              <w:rPr>
+                <w:rFonts w:ascii="Arial" w:hAnsi="Arial" w:cs="Arial"/>
+                <w:b/>
+                <w:bCs/>
+                <w:sz w:val="20"/>
+                <w:szCs w:val="20"/>
+                <w:lang w:val="es-419"/>
+              </w:rPr>
+              <w:t>HASTA</w:t>
+            </w:r>
+          </w:p>
+        </w:tc>
+        <w:tc>
+          <w:tcPr>
+            <w:tcW w:w="402" w:type="pct"/>
+            <w:shd w:val="clear" w:color="auto" w:fill="D9D9D9" w:themeFill="background1" w:themeFillShade="D9"/>
+          </w:tcPr>
+          <w:p>
+            <w:pPr>
+              <w:rPr>
+                <w:rFonts w:ascii="Arial" w:hAnsi="Arial" w:cs="Arial"/>
+                <w:b/>
+                <w:bCs/>
+                <w:sz w:val="20"/>
+                <w:szCs w:val="20"/>
+                <w:lang w:val="es-419"/>
+              </w:rPr>
+            </w:pPr>
+            <w:r>
+              <w:rPr>
+                <w:rFonts w:ascii="Arial" w:hAnsi="Arial" w:cs="Arial"/>
+                <w:b/>
+                <w:bCs/>
+                <w:sz w:val="20"/>
+                <w:szCs w:val="20"/>
+                <w:lang w:val="es-419"/>
+              </w:rPr>
+              <w:t>DÍAS</w:t>
+            </w:r>
+          </w:p>
+        </w:tc>
+        <w:tc>
+          <w:tcPr>
+            <w:tcW w:w="883" w:type="pct"/>
+            <w:shd w:val="clear" w:color="auto" w:fill="D9D9D9" w:themeFill="background1" w:themeFillShade="D9"/>
+          </w:tcPr>
+          <w:p>
+            <w:pPr>
+              <w:rPr>
+                <w:rFonts w:ascii="Arial" w:hAnsi="Arial" w:cs="Arial"/>
+                <w:b/>
+                <w:bCs/>
+                <w:sz w:val="20"/>
+                <w:szCs w:val="20"/>
+                <w:lang w:val="es-419"/>
+              </w:rPr>
+            </w:pPr>
+            <w:r>
+              <w:rPr>
+                <w:rFonts w:ascii="Arial" w:hAnsi="Arial" w:cs="Arial"/>
+                <w:b/>
+                <w:bCs/>
+                <w:sz w:val="20"/>
+                <w:szCs w:val="20"/>
+                <w:lang w:val="es-419"/>
+              </w:rPr>
+              <w:t>OFICIO DE SOLICITUD</w:t>
+            </w:r>
+          </w:p>
+        </w:tc>
+        <w:tc>
+          <w:tcPr>
+            <w:tcW w:w="1069" w:type="pct"/>
+            <w:shd w:val="clear" w:color="auto" w:fill="D9D9D9" w:themeFill="background1" w:themeFillShade="D9"/>
+          </w:tcPr>
+          <w:p>
+            <w:pPr>
+              <w:rPr>
+                <w:rFonts w:ascii="Arial" w:hAnsi="Arial" w:cs="Arial"/>
+                <w:b/>
+                <w:bCs/>
+                <w:sz w:val="20"/>
+                <w:szCs w:val="20"/>
+                <w:lang w:val="es-419"/>
+              </w:rPr>
+            </w:pPr>
+            <w:r>
+              <w:rPr>
+                <w:rFonts w:ascii="Arial" w:hAnsi="Arial" w:cs="Arial"/>
+                <w:b/>
+                <w:bCs/>
+                <w:sz w:val="20"/>
+                <w:szCs w:val="20"/>
+                <w:lang w:val="es-419"/>
+              </w:rPr>
+              <w:t>OFICIO DE AUTORIZACIÓN</w:t>
+            </w:r>
+          </w:p>
+        </w:tc>
+      </w:tr>
+      <w:tr>
+        <w:tc>
+          <w:tcPr>
+            <w:tcW w:w="249" w:type="pct"/>
+          </w:tcPr>
+          <w:p>
+            <w:pPr>
+              <w:rPr>
+                <w:rFonts w:ascii="Arial" w:hAnsi="Arial" w:cs="Arial"/>
+                <w:sz w:val="20"/>
+                <w:szCs w:val="20"/>
+              </w:rPr>
+            </w:pPr>
+            <w:r>
+              <w:rPr>
+                <w:rFonts w:ascii="Arial" w:hAnsi="Arial" w:cs="Arial"/>
+                <w:sz w:val="2"/>
+                <w:szCs w:val="2"/>
+              </w:rPr>
+              <w:t>{#H}</w:t>
+            </w:r>
+            <w:r>
+              <w:rPr>
+                <w:rFonts w:ascii="Arial" w:hAnsi="Arial" w:cs="Arial"/>
+                <w:sz w:val="20"/>
+                <w:szCs w:val="20"/>
+              </w:rPr>
+              <w:t>{</w:t>
+            </w:r>
+            <w:r>
+              <w:rPr>
+                <w:rFonts w:ascii="Arial" w:hAnsi="Arial" w:cs="Arial"/>
+                <w:sz w:val="20"/>
+                <w:szCs w:val="20"/>
+              </w:rPr>
+              <w:t>I}</w:t>
+            </w:r>
+          </w:p>
+        </w:tc>
+        <w:tc>
+          <w:tcPr>
+            <w:tcW w:w="953" w:type="pct"/>
+          </w:tcPr>
+          <w:p>
+            <w:pPr>
+              <w:rPr>
+                <w:rFonts w:ascii="Arial" w:hAnsi="Arial" w:cs="Arial"/>
+                <w:sz w:val="20"/>
+                <w:szCs w:val="20"/>
+                <w:lang w:val="es-419"/>
+              </w:rPr>
+            </w:pPr>
+            <w:r>
+              <w:rPr>
+                <w:rFonts w:ascii="Arial" w:hAnsi="Arial" w:cs="Arial"/>
+                <w:sz w:val="20"/>
+                <w:szCs w:val="20"/>
+                <w:lang w:val="es-419"/>
+              </w:rPr>
+              <w:t>{</w:t>
+            </w:r>
+            <w:r>
+              <w:rPr>
+                <w:rFonts w:ascii="Arial" w:hAnsi="Arial" w:cs="Arial"/>
+                <w:sz w:val="20"/>
+                <w:szCs w:val="20"/>
+                <w:lang w:val="es-419"/>
+              </w:rPr>
+              <w:t>T}</w:t>
+            </w:r>
+          </w:p>
+        </w:tc>
+        <w:tc>
+          <w:tcPr>
+            <w:tcW w:w="722" w:type="pct"/>
+          </w:tcPr>
+          <w:p>
+            <w:pPr>
+              <w:rPr>
+                <w:rFonts w:ascii="Arial" w:hAnsi="Arial" w:cs="Arial"/>
+                <w:sz w:val="20"/>
+                <w:szCs w:val="20"/>
+                <w:lang w:val="es-419"/>
+              </w:rPr>
+            </w:pPr>
+            <w:r>
+              <w:rPr>
+                <w:rFonts w:ascii="Arial" w:hAnsi="Arial" w:cs="Arial"/>
+                <w:sz w:val="20"/>
+                <w:szCs w:val="20"/>
+                <w:lang w:val="es-419"/>
+              </w:rPr>
+              <w:t>{D}</w:t>
+            </w:r>
+          </w:p>
+        </w:tc>
+        <w:tc>
+          <w:tcPr>
+            <w:tcW w:w="723" w:type="pct"/>
+          </w:tcPr>
+          <w:p>
+            <w:pPr>
+              <w:rPr>
+                <w:rFonts w:ascii="Arial" w:hAnsi="Arial" w:cs="Arial"/>
+                <w:sz w:val="20"/>
+                <w:szCs w:val="20"/>
+                <w:lang w:val="es-419"/>
+              </w:rPr>
+            </w:pPr>
+            <w:r>
+              <w:rPr>
+                <w:rFonts w:ascii="Arial" w:hAnsi="Arial" w:cs="Arial"/>
+                <w:sz w:val="20"/>
+                <w:szCs w:val="20"/>
+                <w:lang w:val="es-419"/>
+              </w:rPr>
+              <w:t>{H}</w:t>
+            </w:r>
+          </w:p>
+        </w:tc>
+        <w:tc>
+          <w:tcPr>
+            <w:tcW w:w="402" w:type="pct"/>
+          </w:tcPr>
+          <w:p>
+            <w:pPr>
+              <w:rPr>
+                <w:rFonts w:ascii="Arial" w:hAnsi="Arial" w:cs="Arial"/>
+                <w:sz w:val="20"/>
+                <w:szCs w:val="20"/>
+                <w:lang w:val="es-419"/>
+              </w:rPr>
+            </w:pPr>
+            <w:r>
+              <w:rPr>
+                <w:rFonts w:ascii="Arial" w:hAnsi="Arial" w:cs="Arial"/>
+                <w:sz w:val="20"/>
+                <w:szCs w:val="20"/>
+                <w:lang w:val="es-419"/>
+              </w:rPr>
+              <w:t>{N}</w:t>
+            </w:r>
+          </w:p>
+        </w:tc>
+        <w:tc>
+          <w:tcPr>
+            <w:tcW w:w="883" w:type="pct"/>
+          </w:tcPr>
+          <w:p>
+            <w:pPr>
+              <w:rPr>
+                <w:rFonts w:ascii="Arial" w:hAnsi="Arial" w:cs="Arial"/>
+                <w:sz w:val="20"/>
+                <w:szCs w:val="20"/>
+                <w:lang w:val="es-419"/>
+              </w:rPr>
+            </w:pPr>
+            <w:r>
+              <w:rPr>
+                <w:rFonts w:ascii="Arial" w:hAnsi="Arial" w:cs="Arial"/>
+                <w:sz w:val="20"/>
+                <w:szCs w:val="20"/>
+                <w:lang w:val="es-419"/>
+              </w:rPr>
+              <w:t>{O}</w:t>
+            </w:r>
+          </w:p>
+        </w:tc>
+        <w:tc>
+          <w:tcPr>
+            <w:tcW w:w="1069" w:type="pct"/>
+          </w:tcPr>
+          <w:p>
+            <w:pPr>
+              <w:rPr>
+                <w:rFonts w:ascii="Arial" w:hAnsi="Arial" w:cs="Arial"/>
+                <w:sz w:val="20"/>
+                <w:szCs w:val="20"/>
+                <w:lang w:val="es-419"/>
+              </w:rPr>
+            </w:pPr>
+            <w:r>
+              <w:rPr>
+                <w:rFonts w:ascii="Arial" w:hAnsi="Arial" w:cs="Arial"/>
+                <w:sz w:val="20"/>
+                <w:szCs w:val="20"/>
+                <w:lang w:val="es-419"/>
+              </w:rPr>
+              <w:t>{A}</w:t>
+            </w:r>
+            <w:r>
+              <w:rPr>
+                <w:rFonts w:ascii="Arial" w:hAnsi="Arial" w:cs="Arial"/>
+                <w:sz w:val="2"/>
+                <w:szCs w:val="2"/>
+                <w:lang w:val="es-419"/>
+              </w:rPr>
+              <w:t>{/H}</w:t>
+            </w:r>
+          </w:p>
+        </w:tc>
+      </w:tr>
+    </w:tbl>
+    <w:p>
+      <w:pPr>
+        <w:rPr>
+          <w:rFonts w:ascii="Arial" w:hAnsi="Arial" w:cs="Arial"/>
+          <w:b/>
+          <w:bCs/>
+          <w:sz w:val="20"/>
+          <w:szCs w:val="20"/>
+          <w:lang w:val="es-419"/>
+        </w:rPr>
+      </w:pPr>
     </w:p>
     <w:sectPr>
       <w:pgSz w:w="12240" w:h="15840"/>
@@ -1856,6 +2301,22 @@
       </w:tblBorders>
     </w:tblPr>
   </w:style>
+  <w:style w:type="character" w:customStyle="1" w:styleId="icon-label">
+    <w:name w:val="icon-label"/>
+    <w:basedOn w:val="Fuentedeprrafopredeter"/>
+    <w:rsid w:val="00A861C0"/>
+  </w:style>
+  <w:style w:type="character" w:styleId="Hipervnculo">
+    <w:name w:val="Hyperlink"/>
+    <w:basedOn w:val="Fuentedeprrafopredeter"/>
+    <w:uiPriority w:val="99"/>
+    <w:unhideWhenUsed/>
+    <w:rsid w:val="00A861C0"/>
+    <w:rPr>
+      <w:color w:val="0563C1" w:themeColor="hyperlink"/>
+      <w:u w:val="single"/>
+    </w:rPr>
+  </w:style>
 </w:styles>
 </file>
 
@@ -2152,4 +2613,16 @@
     </a:ext>
   </a:extLst>
 </a:theme>
+</file>
+
+<file path=customXml/item1.xml><?xml version="1.0" encoding="utf-8"?>
+<b:Sources xmlns:b="http://schemas.openxmlformats.org/officeDocument/2006/bibliography" xmlns="http://schemas.openxmlformats.org/officeDocument/2006/bibliography" SelectedStyle="\APASixthEditionOfficeOnline.xsl" StyleName="APA" Version="6"/>
+</file>
+
+<file path=customXml/itemProps1.xml><?xml version="1.0" encoding="utf-8"?>
+<ds:datastoreItem xmlns:ds="http://schemas.openxmlformats.org/officeDocument/2006/customXml" ds:itemID="{1B770A13-7415-44B4-A0E2-EBD8675D57A0}">
+  <ds:schemaRefs>
+    <ds:schemaRef ds:uri="http://schemas.openxmlformats.org/officeDocument/2006/bibliography"/>
+  </ds:schemaRefs>
+</ds:datastoreItem>
 </file>
</xml_diff>